<commit_message>
fall 2025 end version
</commit_message>
<xml_diff>
--- a/prototype two/what do you think about adding a test filed.docx
+++ b/prototype two/what do you think about adding a test filed.docx
@@ -931,25 +931,558 @@
     <w:p/>
     <w:p>
       <w:r>
-        <w:t xml:space="preserve">add to the </w:t>
-      </w:r>
-      <w:r>
-        <w:t>training</w:t>
-      </w:r>
-      <w:r>
-        <w:t xml:space="preserve"> progress plot </w:t>
-      </w:r>
-      <w:r>
-        <w:t>title</w:t>
-      </w:r>
-      <w:r>
-        <w:t xml:space="preserve"> the name of the model </w:t>
+        <w:t xml:space="preserve">add to the training progress plot title the name of the model </w:t>
       </w:r>
     </w:p>
     <w:p/>
     <w:p>
       <w:r>
         <w:t>at the beginning of the training cycle save a csv with the settings used for the model, also add a total time per epoch and a total training time to the terminal output and the saved terminal output csv</w:t>
+      </w:r>
+    </w:p>
+    <w:p/>
+    <w:p>
+      <w:r>
+        <w:t xml:space="preserve">for reports add a plot that uses the average of three data points and then plots the velocity and Renold’s number </w:t>
+      </w:r>
+    </w:p>
+    <w:p/>
+    <w:p>
+      <w:r>
+        <w:t xml:space="preserve">now make a line of best fit for the </w:t>
+      </w:r>
+      <w:proofErr w:type="gramStart"/>
+      <w:r>
+        <w:t>100 point</w:t>
+      </w:r>
+      <w:proofErr w:type="gramEnd"/>
+      <w:r>
+        <w:t xml:space="preserve"> average </w:t>
+      </w:r>
+    </w:p>
+    <w:p/>
+    <w:p>
+      <w:r>
+        <w:t xml:space="preserve">make the line of best fit </w:t>
+      </w:r>
+      <w:proofErr w:type="gramStart"/>
+      <w:r>
+        <w:t>a</w:t>
+      </w:r>
+      <w:proofErr w:type="gramEnd"/>
+      <w:r>
+        <w:t xml:space="preserve"> 8</w:t>
+      </w:r>
+      <w:r>
+        <w:rPr>
+          <w:vertAlign w:val="superscript"/>
+        </w:rPr>
+        <w:t>th</w:t>
+      </w:r>
+      <w:r>
+        <w:t xml:space="preserve"> order polynomial and have it plot as yellow</w:t>
+      </w:r>
+    </w:p>
+    <w:p/>
+    <w:p>
+      <w:r>
+        <w:t>now make a new</w:t>
+      </w:r>
+      <w:r>
+        <w:t xml:space="preserve"> independent </w:t>
+      </w:r>
+      <w:r>
+        <w:t xml:space="preserve">plot </w:t>
+      </w:r>
+      <w:r>
+        <w:t xml:space="preserve">for velocity and re number </w:t>
+      </w:r>
+      <w:r>
+        <w:t xml:space="preserve">that runs </w:t>
+      </w:r>
+      <w:r>
+        <w:t>6</w:t>
+      </w:r>
+      <w:r>
+        <w:rPr>
+          <w:vertAlign w:val="superscript"/>
+        </w:rPr>
+        <w:t>th</w:t>
+      </w:r>
+      <w:r>
+        <w:t xml:space="preserve"> order Butterworth filter and then plot </w:t>
+      </w:r>
+    </w:p>
+    <w:p/>
+    <w:p>
+      <w:pPr>
+        <w:tabs>
+          <w:tab w:val="center" w:pos="4680"/>
+        </w:tabs>
+      </w:pPr>
+      <w:r>
+        <w:t xml:space="preserve">list all the library’s used in this project </w:t>
+      </w:r>
+      <w:r>
+        <w:tab/>
+      </w:r>
+    </w:p>
+    <w:p>
+      <w:pPr>
+        <w:tabs>
+          <w:tab w:val="center" w:pos="4680"/>
+        </w:tabs>
+      </w:pPr>
+    </w:p>
+    <w:p>
+      <w:pPr>
+        <w:tabs>
+          <w:tab w:val="center" w:pos="4680"/>
+        </w:tabs>
+      </w:pPr>
+      <w:r>
+        <w:t xml:space="preserve">now make a pip install list </w:t>
+      </w:r>
+    </w:p>
+    <w:p>
+      <w:pPr>
+        <w:tabs>
+          <w:tab w:val="center" w:pos="4680"/>
+        </w:tabs>
+      </w:pPr>
+    </w:p>
+    <w:p>
+      <w:pPr>
+        <w:tabs>
+          <w:tab w:val="center" w:pos="4680"/>
+        </w:tabs>
+      </w:pPr>
+      <w:r>
+        <w:t>I need the code to</w:t>
+      </w:r>
+    </w:p>
+    <w:p>
+      <w:pPr>
+        <w:tabs>
+          <w:tab w:val="center" w:pos="4680"/>
+        </w:tabs>
+      </w:pPr>
+    </w:p>
+    <w:p>
+      <w:pPr>
+        <w:tabs>
+          <w:tab w:val="center" w:pos="4680"/>
+        </w:tabs>
+      </w:pPr>
+      <w:r>
+        <w:t xml:space="preserve">Explain this </w:t>
+      </w:r>
+    </w:p>
+    <w:p>
+      <w:pPr>
+        <w:tabs>
+          <w:tab w:val="center" w:pos="4680"/>
+        </w:tabs>
+      </w:pPr>
+    </w:p>
+    <w:p>
+      <w:pPr>
+        <w:tabs>
+          <w:tab w:val="center" w:pos="4680"/>
+        </w:tabs>
+      </w:pPr>
+      <w:r>
+        <w:t xml:space="preserve">Add to the train.py terminal output what the name of the </w:t>
+      </w:r>
+      <w:proofErr w:type="spellStart"/>
+      <w:r>
+        <w:t>gpu</w:t>
+      </w:r>
+      <w:proofErr w:type="spellEnd"/>
+      <w:r>
+        <w:t xml:space="preserve"> or </w:t>
+      </w:r>
+      <w:proofErr w:type="spellStart"/>
+      <w:r>
+        <w:t>cpu</w:t>
+      </w:r>
+      <w:proofErr w:type="spellEnd"/>
+      <w:r>
+        <w:t xml:space="preserve"> is </w:t>
+      </w:r>
+    </w:p>
+    <w:p>
+      <w:pPr>
+        <w:tabs>
+          <w:tab w:val="center" w:pos="4680"/>
+        </w:tabs>
+      </w:pPr>
+    </w:p>
+    <w:p>
+      <w:pPr>
+        <w:tabs>
+          <w:tab w:val="center" w:pos="4680"/>
+        </w:tabs>
+      </w:pPr>
+      <w:r>
+        <w:t xml:space="preserve">What </w:t>
+      </w:r>
+      <w:proofErr w:type="spellStart"/>
+      <w:r>
+        <w:t>pytorch</w:t>
+      </w:r>
+      <w:proofErr w:type="spellEnd"/>
+      <w:r>
+        <w:t xml:space="preserve"> code do ii run to see what devices are available </w:t>
+      </w:r>
+    </w:p>
+    <w:p>
+      <w:pPr>
+        <w:tabs>
+          <w:tab w:val="center" w:pos="4680"/>
+        </w:tabs>
+      </w:pPr>
+    </w:p>
+    <w:p>
+      <w:pPr>
+        <w:tabs>
+          <w:tab w:val="center" w:pos="4680"/>
+        </w:tabs>
+      </w:pPr>
+      <w:proofErr w:type="spellStart"/>
+      <w:r>
+        <w:t>Im</w:t>
+      </w:r>
+      <w:proofErr w:type="spellEnd"/>
+      <w:r>
+        <w:t xml:space="preserve"> running this code on a different laptop with a rtx4060 </w:t>
+      </w:r>
+      <w:proofErr w:type="spellStart"/>
+      <w:r>
+        <w:t>gpu</w:t>
+      </w:r>
+      <w:proofErr w:type="spellEnd"/>
+      <w:r>
+        <w:t xml:space="preserve"> but </w:t>
+      </w:r>
+      <w:proofErr w:type="spellStart"/>
+      <w:r>
+        <w:t>pytorch</w:t>
+      </w:r>
+      <w:proofErr w:type="spellEnd"/>
+      <w:r>
+        <w:t xml:space="preserve"> </w:t>
+      </w:r>
+      <w:proofErr w:type="spellStart"/>
+      <w:proofErr w:type="gramStart"/>
+      <w:r>
+        <w:t>wont</w:t>
+      </w:r>
+      <w:proofErr w:type="spellEnd"/>
+      <w:proofErr w:type="gramEnd"/>
+      <w:r>
+        <w:t xml:space="preserve"> see the </w:t>
+      </w:r>
+      <w:proofErr w:type="spellStart"/>
+      <w:r>
+        <w:t>gpu</w:t>
+      </w:r>
+      <w:proofErr w:type="spellEnd"/>
+      <w:r>
+        <w:t xml:space="preserve">. Put it work son </w:t>
+      </w:r>
+      <w:proofErr w:type="spellStart"/>
+      <w:r>
+        <w:t>gpu</w:t>
+      </w:r>
+      <w:proofErr w:type="spellEnd"/>
+      <w:r>
+        <w:t xml:space="preserve"> on this laptop </w:t>
+      </w:r>
+    </w:p>
+    <w:p>
+      <w:pPr>
+        <w:tabs>
+          <w:tab w:val="center" w:pos="4680"/>
+        </w:tabs>
+      </w:pPr>
+    </w:p>
+    <w:p>
+      <w:pPr>
+        <w:tabs>
+          <w:tab w:val="center" w:pos="4680"/>
+        </w:tabs>
+      </w:pPr>
+      <w:r>
+        <w:t>That did not work</w:t>
+      </w:r>
+    </w:p>
+    <w:p>
+      <w:pPr>
+        <w:tabs>
+          <w:tab w:val="center" w:pos="4680"/>
+        </w:tabs>
+      </w:pPr>
+    </w:p>
+    <w:p>
+      <w:pPr>
+        <w:tabs>
+          <w:tab w:val="center" w:pos="4680"/>
+        </w:tabs>
+      </w:pPr>
+    </w:p>
+    <w:p>
+      <w:pPr>
+        <w:tabs>
+          <w:tab w:val="center" w:pos="4680"/>
+        </w:tabs>
+      </w:pPr>
+    </w:p>
+    <w:p>
+      <w:pPr>
+        <w:tabs>
+          <w:tab w:val="center" w:pos="4680"/>
+        </w:tabs>
+      </w:pPr>
+    </w:p>
+    <w:p>
+      <w:pPr>
+        <w:tabs>
+          <w:tab w:val="center" w:pos="4680"/>
+        </w:tabs>
+      </w:pPr>
+    </w:p>
+    <w:p>
+      <w:pPr>
+        <w:tabs>
+          <w:tab w:val="center" w:pos="4680"/>
+        </w:tabs>
+      </w:pPr>
+      <w:r>
+        <w:lastRenderedPageBreak/>
+        <w:t xml:space="preserve">Create a new python program that will run one epoch at a time and step through a list of setting for each epoch. Use the form of [16,13,48] for batch size and [2,4,6] for num of workers. I want to change one setting at a time so step through the batch size with each num of workers. In the end I want a plot of the settings used and against the time taken and images per second processed   </w:t>
+      </w:r>
+    </w:p>
+    <w:p>
+      <w:pPr>
+        <w:tabs>
+          <w:tab w:val="center" w:pos="4680"/>
+        </w:tabs>
+      </w:pPr>
+    </w:p>
+    <w:p>
+      <w:pPr>
+        <w:tabs>
+          <w:tab w:val="center" w:pos="4680"/>
+        </w:tabs>
+      </w:pPr>
+      <w:r>
+        <w:t xml:space="preserve">make a new code that works with the rest of the project that combines both the </w:t>
+      </w:r>
+      <w:proofErr w:type="spellStart"/>
+      <w:r>
+        <w:t>bench_epoch</w:t>
+      </w:r>
+      <w:proofErr w:type="spellEnd"/>
+      <w:r>
+        <w:t xml:space="preserve"> and analyze bench that will output the optimal settings for the config </w:t>
+      </w:r>
+    </w:p>
+    <w:p>
+      <w:pPr>
+        <w:tabs>
+          <w:tab w:val="center" w:pos="4680"/>
+        </w:tabs>
+      </w:pPr>
+    </w:p>
+    <w:p>
+      <w:pPr>
+        <w:tabs>
+          <w:tab w:val="center" w:pos="4680"/>
+        </w:tabs>
+      </w:pPr>
+    </w:p>
+    <w:p>
+      <w:pPr>
+        <w:tabs>
+          <w:tab w:val="center" w:pos="4680"/>
+        </w:tabs>
+      </w:pPr>
+      <w:r>
+        <w:t xml:space="preserve">now make a master control program code that will start train, infer and reports in order. I want one file that I can run to start the whole pipeline. Add a section to the config labeled MCP for the master control program and have a true false toggle for each program used by it </w:t>
+      </w:r>
+    </w:p>
+    <w:p>
+      <w:pPr>
+        <w:tabs>
+          <w:tab w:val="center" w:pos="4680"/>
+        </w:tabs>
+      </w:pPr>
+    </w:p>
+    <w:p>
+      <w:pPr>
+        <w:tabs>
+          <w:tab w:val="center" w:pos="4680"/>
+        </w:tabs>
+      </w:pPr>
+      <w:r>
+        <w:t>set_one_bench_epoch_results</w:t>
+      </w:r>
+      <w:r>
+        <w:t>.csv</w:t>
+      </w:r>
+    </w:p>
+    <w:p>
+      <w:pPr>
+        <w:tabs>
+          <w:tab w:val="center" w:pos="4680"/>
+        </w:tabs>
+      </w:pPr>
+      <w:r>
+        <w:t>set_</w:t>
+      </w:r>
+      <w:r>
+        <w:t>two</w:t>
+      </w:r>
+      <w:r>
+        <w:t>_bench_epoch_results</w:t>
+      </w:r>
+      <w:r>
+        <w:t>.csv</w:t>
+      </w:r>
+    </w:p>
+    <w:p>
+      <w:pPr>
+        <w:tabs>
+          <w:tab w:val="center" w:pos="4680"/>
+        </w:tabs>
+      </w:pPr>
+      <w:r>
+        <w:t>set_</w:t>
+      </w:r>
+      <w:r>
+        <w:t>three</w:t>
+      </w:r>
+      <w:r>
+        <w:t>_bench_epoch_results</w:t>
+      </w:r>
+      <w:r>
+        <w:t>.csv</w:t>
+      </w:r>
+    </w:p>
+    <w:p>
+      <w:pPr>
+        <w:tabs>
+          <w:tab w:val="center" w:pos="4680"/>
+        </w:tabs>
+      </w:pPr>
+      <w:r>
+        <w:t>set_</w:t>
+      </w:r>
+      <w:r>
+        <w:t>four</w:t>
+      </w:r>
+      <w:r>
+        <w:t>_bench_epoch_results</w:t>
+      </w:r>
+      <w:r>
+        <w:t>.csv</w:t>
+      </w:r>
+    </w:p>
+    <w:p>
+      <w:pPr>
+        <w:tabs>
+          <w:tab w:val="center" w:pos="4680"/>
+        </w:tabs>
+      </w:pPr>
+      <w:r>
+        <w:t>set_</w:t>
+      </w:r>
+      <w:r>
+        <w:t>five</w:t>
+      </w:r>
+      <w:r>
+        <w:t>_bench_epoch_results</w:t>
+      </w:r>
+      <w:r>
+        <w:t>.csv</w:t>
+      </w:r>
+    </w:p>
+    <w:p>
+      <w:pPr>
+        <w:tabs>
+          <w:tab w:val="center" w:pos="4680"/>
+        </w:tabs>
+      </w:pPr>
+    </w:p>
+    <w:p>
+      <w:pPr>
+        <w:tabs>
+          <w:tab w:val="center" w:pos="4680"/>
+        </w:tabs>
+      </w:pPr>
+      <w:r>
+        <w:t>[4, 8, 12, 16,</w:t>
+      </w:r>
+      <w:r>
+        <w:t xml:space="preserve"> 20, 28,</w:t>
+      </w:r>
+      <w:r>
+        <w:t xml:space="preserve"> 32, 48, 64]</w:t>
+      </w:r>
+    </w:p>
+    <w:p>
+      <w:pPr>
+        <w:tabs>
+          <w:tab w:val="center" w:pos="4680"/>
+        </w:tabs>
+      </w:pPr>
+      <w:r>
+        <w:t xml:space="preserve"> [2, 4,</w:t>
+      </w:r>
+      <w:r>
+        <w:t xml:space="preserve"> 5,</w:t>
+      </w:r>
+      <w:r>
+        <w:t xml:space="preserve"> 6,</w:t>
+      </w:r>
+      <w:r>
+        <w:t xml:space="preserve"> 7,</w:t>
+      </w:r>
+      <w:r>
+        <w:t xml:space="preserve"> 8, 10, 12, 14, 16, 18]</w:t>
+      </w:r>
+    </w:p>
+    <w:p>
+      <w:pPr>
+        <w:tabs>
+          <w:tab w:val="center" w:pos="4680"/>
+        </w:tabs>
+      </w:pPr>
+    </w:p>
+    <w:p>
+      <w:pPr>
+        <w:tabs>
+          <w:tab w:val="center" w:pos="4680"/>
+        </w:tabs>
+      </w:pPr>
+    </w:p>
+    <w:p>
+      <w:pPr>
+        <w:tabs>
+          <w:tab w:val="center" w:pos="4680"/>
+        </w:tabs>
+      </w:pPr>
+      <w:r>
+        <w:t xml:space="preserve">I need an explanation of the </w:t>
+      </w:r>
+      <w:proofErr w:type="spellStart"/>
+      <w:r>
+        <w:t>cnn</w:t>
+      </w:r>
+      <w:proofErr w:type="spellEnd"/>
+      <w:r>
+        <w:t xml:space="preserve"> structure for a report. Do not actually make a report summary but explain the structure so I can make the report section  </w:t>
       </w:r>
     </w:p>
     <w:sectPr>
@@ -1874,6 +2407,7 @@
   <w:style w:type="character" w:default="1" w:styleId="DefaultParagraphFont">
     <w:name w:val="Default Paragraph Font"/>
     <w:uiPriority w:val="1"/>
+    <w:semiHidden/>
     <w:unhideWhenUsed/>
   </w:style>
   <w:style w:type="table" w:default="1" w:styleId="TableNormal">

</xml_diff>